<commit_message>
randomly generated bomb locations
</commit_message>
<xml_diff>
--- a/Dokumentacja.docx
+++ b/Dokumentacja.docx
@@ -45,6 +45,11 @@
     <w:p>
       <w:r>
         <w:t>3.06.26 menu główne</w:t>
+      </w:r>
+    </w:p>
+    <w:p>
+      <w:r>
+        <w:t>10.06.26 Losowo generowane pozycje bomb</w:t>
       </w:r>
     </w:p>
     <w:sectPr>

</xml_diff>

<commit_message>
empty space logic and stuff
</commit_message>
<xml_diff>
--- a/Dokumentacja.docx
+++ b/Dokumentacja.docx
@@ -50,6 +50,11 @@
     <w:p>
       <w:r>
         <w:t>10.06.26 Losowo generowane pozycje bomb</w:t>
+      </w:r>
+    </w:p>
+    <w:p>
+      <w:r>
+        <w:t>11.06.26 logika pustych pól sąsiadujących z bombami</w:t>
       </w:r>
     </w:p>
     <w:sectPr>

</xml_diff>